<commit_message>
Job queue release: one queue owns the GPU, Sound Effects, Image → 3D, Language workspace, Film Recipe, Everything Before demo
- One job queue in front of every tab: no Load buttons, measured ETAs, restart-safe,
  and cancel now stops the job's work inside ComfyUI too
- New tabs: Sound Effects (Stable Audio 3.0 Small SFX), Image → 3D (Hunyuan3D 2.1);
  reference-clip cleanup (DeepFilterNet) for voice cloning
- Language tab writes real files to a sandboxed workspace and keeps conversations
- Runbook: 29 → 32 embedded files, phases 5i/5j
- docs: Film Recipe (new), regenerated guides, new screenshots
- README: Everything Before leads the Demo
- Licensed under Apache-2.0 (LICENSE + NOTICE)

Co-Authored-By: Claude Opus 5.5 <noreply@anthropic.com>
</commit_message>
<xml_diff>
--- a/docs/Install_and_Troubleshooting.docx
+++ b/docs/Install_and_Troubleshooting.docx
@@ -29,7 +29,17 @@
     </w:p>
     <w:p>
       <w:r>
-        <w:t>A private AI studio in your browser: chat (with an optional uncensored mode), image generation and editing, a 2D game sprite generator (one character image in → a full style-matched animation set with transparent backgrounds and ready-to-use sprite sheets), a video generator that makes the picture and its sound together in one pass (MiniMax H3 — see the licence note in §5 before you share anything you make with it), full song generation (ACE-Step 1.5 — style tags + lyrics in, finished track out), a Composer (a text brief in → a fully arranged, mixed, multitrack instrumental out — a local LLM plans the direction, a deterministic engine plays and mixes every note on General MIDI instruments), a Lullaby maker (any song in → a soft piano/instrumental lullaby out) and a Track Splitter (any song → its 6 separate instrument tracks), speech-to-text, text-to-speech in 54 voices, your own cloned voice (Voice Studio), a story/novel writer, and an audiobook maker that narrates your stories with natural pacing. Everything runs on your own GPU — no accounts, no API keys, no cost per use.</w:t>
+        <w:t>A private AI studio in your browser: chat (with an optional uncensored mode), image generation and editing, a 2D game sprite generator (one character image in → a full style-matched animation set with transparent backgrounds and ready-to-use sprite sheets), a video generator that makes the picture and its sound together in one pass (MiniMax H3 — see the licence note in §5 before you share anything you make with it), full song generation (ACE-Step 1.5 — style tags + lyrics in, finished track out), a Composer (a text brief in → a fully arranged, mixed, multitrack instrumental out — a local LLM plans the direction, a deterministic engine plays and mixes every note on General MIDI instruments), a Lullaby maker (any song in → a soft piano/instrumental lullaby out) and a Track Splitter (any song → its 6 separate instrument tracks), speech-to-text, text-to-speech in 54 voices, your own cloned voice (Voice Studio), a story/novel writer, and an audiobook maker that narrates your stories with natural pacing, sound effects for games (describe it, get several takes back in a few seconds), and Image → 3D, which turns one reference picture into a 3D model you can open in Blender. Everything runs on your own GPU — no accounts, no API keys, no cost per use.</w:t>
+      </w:r>
+    </w:p>
+    <w:p>
+      <w:r>
+        <w:t>The chat remembers. Every conversation in the Language tab is kept and listed beside it, named after the question that started it, with its turn count and the files it made — click one to pick it up where you left it. They are saved on the machine rather than in the browser tab, so a reload, a second window, or restarting the studio all come back to the same thread. Deleting a conversation never deletes the files it made.</w:t>
+      </w:r>
+    </w:p>
+    <w:p>
+      <w:r>
+        <w:t>You never have to load anything. There is one job queue: whatever you ask for from any tab joins it, and the studio works out which model that needs, loads it, runs the job and frees it again for the next one. Queue a video, four pictures, a song and a 3D model in whatever order you like, then go and do something else — the Queue button at the top right shows how many jobs are left and roughly how long, and the drawer shows what is running now.</w:t>
       </w:r>
     </w:p>
     <w:p>
@@ -86,7 +96,17 @@
     </w:p>
     <w:p>
       <w:r>
-        <w:t>Start: double-click 'Studio Control Panel.vbs' and press Start All (or run 'studio start'), then open http://127.0.0.1:8800. No console windows appear — every service runs hidden. Each tab has a Load model button — the studio keeps ONE model in the GPU at a time, so loading a new tab's model frees the previous one. Stop model (or Stop All) frees the GPU.</w:t>
+        <w:t>Start: double-click 'Studio Control Panel.vbs' and press Start All (or run 'studio start'), then open http://127.0.0.1:8800. No console windows appear — every service runs hidden. Then just use it: fill in a tab and press its button. There is nothing to load first.</w:t>
+      </w:r>
+    </w:p>
+    <w:p>
+      <w:r>
+        <w:t>The queue, in one paragraph. Your graphics card can only hold one big model at a time, so the studio runs your jobs one after another and swaps models between them. Everything you submit — from any tab — lines up in the same queue. The Queue button at the top right shows how many jobs are waiting and how long is left; click it to see them, with what each one is waiting for. ▲ moves a job up, × cancels it. Chat, transcription and single lines of speech skip the line, so the studio still answers you straight away while something long is rendering. Times are measured from your own past runs, not guessed — the first time you do something new it will say 'never run before' rather than make a number up, and it will know next time. If you close the studio with work still queued, it is still there when you come back.</w:t>
+      </w:r>
+    </w:p>
+    <w:p>
+      <w:r>
+        <w:t>The one thing worth knowing: PINNING. If you are iterating hard on one tab — twenty images in a row — pin its model on the Home tab and it stays in the card between jobs instead of being swapped out. While something is pinned, queued work that needs a different model waits and says so. Unpin when you are done. Home also has Reclaim RAM: ComfyUI keeps a copy of every model it has loaded in system memory and does not give it back, so if a big language model refuses to load after a lot of image or video work, press it — it restarts ComfyUI and takes about 20 seconds.</w:t>
       </w:r>
     </w:p>
     <w:p>
@@ -106,7 +126,7 @@
     </w:p>
     <w:p>
       <w:r>
-        <w:t>Video tips: press Load video model first — it frees every other model, which the Video tab needs more than any other (the model is larger than the graphics card and streams from system RAM as it works). Describe the SOUND as well as the shot: picture and audio come out of the same pass, so 'waves crash outside; his boots echo on the metal steps' is part of the prompt, not decoration. Leave Resolution on 768p — it is the resolution the model was trained at, and lower settings produce a good-looking shot that barely moves (measured: 89 of 100 frames near-identical at 480p, 0 of 100 at 768p). Use the lower settings only to check framing, and never judge motion from one. First/last frame mode animates a picture you already have (give it one keyframe) or fills in between two (give it both); References mode takes up to 9 images, 3 clips and 3 audio files and you point at them in the prompt as &lt;Picture 1&gt;, &lt;Video 1&gt;, &lt;Audio 1&gt;. Expect tens of minutes for a five-second clip — that is normal for this model on a 16 GB card. The progress line is a real measured countdown rather than a spinner, though the first render of any given size/length says 'measuring…' until it has timed a step. Everything lands in local-ai-studio\videos\.</w:t>
+        <w:t>Video tips: just press Generate — the queue frees every other model for it, which the Video tab needs more than any other (the model is larger than the graphics card and streams from system RAM as it works), and that eviction is most of the pause before the first step. Describe the SOUND as well as the shot: picture and audio come out of the same pass, so 'waves crash outside; his boots echo on the metal steps' is part of the prompt, not decoration. Leave Resolution on 768p — it is the resolution the model was trained at, and lower settings produce a good-looking shot that barely moves (measured: 89 of 100 frames near-identical at 480p, 0 of 100 at 768p). Use the lower settings only to check framing, and never judge motion from one. First/last frame mode animates a picture you already have (give it one keyframe) or fills in between two (give it both); References mode takes up to 9 images, 3 clips and 3 audio files and you point at them in the prompt as &lt;Picture 1&gt;, &lt;Video 1&gt;, &lt;Audio 1&gt;. Expect tens of minutes for a five-second clip — that is normal for this model on a 16 GB card. The progress line is a real measured countdown rather than a spinner, though the first render of any given size/length says 'measuring…' until it has timed a step. Everything lands in local-ai-studio\videos\.</w:t>
       </w:r>
     </w:p>
     <w:p>
@@ -116,7 +136,7 @@
     </w:p>
     <w:p>
       <w:r>
-        <w:t>Lullaby tips: upload a song and press 'Analyze song' first — this separates it into 6 tracks and shows a waveform, so you can listen to and weight each stem before rendering. Remix (the default engine) sounds closest to the original; Piano rebuilds it as a completely different, storybook-style arrangement; Melody Match traces the actual sung tune onto a single instrument (cello by default) when you want the melody itself clearly recognizable rather than an AI reimagining or a quantized arrangement — pick just the vocals track for it if that's the line you want followed. In Melody Match, each ticked track has its own Route dropdown: leave it on 'Melody Match' for the line you want traced onto the instrument, or switch it to 'Piano arrangement' for a track you'd rather hear rebuilt as a full backing arrangement instead (e.g. vocals on cello, an existing piano part rebuilt) — both are mixed into one render, and an optional ACE-Step polish pass can run over the result afterward. If a Remix render still sounds a bit bright or busy, raise the Denoise slider slightly; for a sleepier feel on any engine, lower the tempo. Stop any loaded model first — Lullaby and Track Splitter need the whole GPU to themselves.</w:t>
+        <w:t>Lullaby tips: upload a song and press 'Analyze song' first — this separates it into 6 tracks and shows a waveform, so you can listen to and weight each stem before rendering. Remix (the default engine) sounds closest to the original; Piano rebuilds it as a completely different, storybook-style arrangement; Melody Match traces the actual sung tune onto a single instrument (cello by default) when you want the melody itself clearly recognizable rather than an AI reimagining or a quantized arrangement — pick just the vocals track for it if that's the line you want followed. In Melody Match, each ticked track has its own Route dropdown: leave it on 'Melody Match' for the line you want traced onto the instrument, or switch it to 'Piano arrangement' for a track you'd rather hear rebuilt as a full backing arrangement instead (e.g. vocals on cello, an existing piano part rebuilt) — both are mixed into one render, and an optional ACE-Step polish pass can run over the result afterward. If a Remix render still sounds a bit bright or busy, raise the Denoise slider slightly; for a sleepier feel on any engine, lower the tempo. Lullaby and Track Splitter need the whole GPU to themselves, but you no longer have to do anything about that — the queue frees it for them.</w:t>
       </w:r>
     </w:p>
     <w:p>
@@ -126,7 +146,7 @@
     </w:p>
     <w:p>
       <w:r>
-        <w:t>Composer tips: describe the song in the brief box (mood, energy, what it's for) and pick a genre — the genre picks sensible defaults even if you leave the brief short. 'Set up' also has a quick-brief preset row for a fast starting point. Leave 'Plan with AI' on for the model to choose instruments/structure/chords to fit your brief; turn it off for an instant, model-free render straight from the genre template (useful for a quick sketch or if the Language model isn't loaded). After it composes, the Arrange step is a real mini-DAW: the clip grid shows which track plays in which section, click a track to open its mixer (level/pan/reverb/delay/drive, automation) and piano roll (drag notes, fix a clashing pitch, tighten timing), then press Re-render — this only re-runs the deterministic engine, so it's fast and never calls the model again. Export gives you the master (MP3/WAV), a multitrack MIDI file, and every instrument as its own stem. Composer needs the whole GPU free the same as Lullaby/Track Splitter if you also want the Language model loaded for planning; the render itself is CPU-only.</w:t>
+        <w:t>Composer tips: describe the song in the brief box (mood, energy, what it's for) and pick a genre — the genre picks sensible defaults even if you leave the brief short. 'Set up' also has a quick-brief preset row for a fast starting point. Leave 'Plan with AI' on for the model to choose instruments/structure/chords to fit your brief; turn it off for an instant, model-free render straight from the genre template (useful for a quick sketch or if the Language model isn't loaded). After it composes, the Arrange step is a real mini-DAW: the clip grid shows which track plays in which section, click a track to open its mixer (level/pan/reverb/delay/drive, automation) and piano roll (drag notes, fix a clashing pitch, tighten timing), then press Re-render — this only re-runs the deterministic engine, so it's fast and never calls the model again. Export gives you the master (MP3/WAV), a multitrack MIDI file, and every instrument as its own stem. The render itself is CPU-only, so it runs on its own lane and does not hold up anything queued on the graphics card.</w:t>
       </w:r>
     </w:p>
     <w:p>
@@ -189,7 +209,7 @@
           </w:tcPr>
           <w:p>
             <w:r>
-              <w:t>A tab says its model isn't loaded</w:t>
+              <w:t>A job sits in the queue saying 'waiting — a model is pinned'</w:t>
             </w:r>
           </w:p>
         </w:tc>
@@ -199,7 +219,7 @@
           </w:tcPr>
           <w:p>
             <w:r>
-              <w:t>Click Load model on that tab; wait for the status pill to show it</w:t>
+              <w:t>Something is pinned on the Home tab and the queue will not evict it. Unpin, and the job starts</w:t>
             </w:r>
           </w:p>
         </w:tc>
@@ -221,7 +241,51 @@
           </w:tcPr>
           <w:p>
             <w:r>
-              <w:t>Another model is holding the GPU — Stop it first (one model at a time)</w:t>
+              <w:t>Another model is holding the GPU. The queue normally prevents this; if it happens, unpin whatever is pinned on Home</w:t>
+            </w:r>
+          </w:p>
+        </w:tc>
+      </w:tr>
+      <w:tr>
+        <w:tc>
+          <w:tcPr>
+            <w:tcW w:type="dxa" w:w="4320"/>
+          </w:tcPr>
+          <w:p>
+            <w:r>
+              <w:t>A big model won't load after a lot of image or video work</w:t>
+            </w:r>
+          </w:p>
+        </w:tc>
+        <w:tc>
+          <w:tcPr>
+            <w:tcW w:type="dxa" w:w="4320"/>
+          </w:tcPr>
+          <w:p>
+            <w:r>
+              <w:t>Press Reclaim RAM on the Home tab. ComfyUI keeps its weights in system memory and only gives them back when it restarts (~20 s)</w:t>
+            </w:r>
+          </w:p>
+        </w:tc>
+      </w:tr>
+      <w:tr>
+        <w:tc>
+          <w:tcPr>
+            <w:tcW w:type="dxa" w:w="4320"/>
+          </w:tcPr>
+          <w:p>
+            <w:r>
+              <w:t>Everything queued behind one long render</w:t>
+            </w:r>
+          </w:p>
+        </w:tc>
+        <w:tc>
+          <w:tcPr>
+            <w:tcW w:type="dxa" w:w="4320"/>
+          </w:tcPr>
+          <w:p>
+            <w:r>
+              <w:t>Use ▲ on the job you want next, or × to cancel the one in front. Chat, transcription and speech already skip the line automatically</w:t>
             </w:r>
           </w:p>
         </w:tc>
@@ -287,7 +351,51 @@
           </w:tcPr>
           <w:p>
             <w:r>
-              <w:t>Prompt too long for the thinking budget — shorten it, or reload the model</w:t>
+              <w:t>The model spent its whole budget thinking. It retries once at shallower effort by itself; if it still comes back empty, shorten the prompt</w:t>
+            </w:r>
+          </w:p>
+        </w:tc>
+      </w:tr>
+      <w:tr>
+        <w:tc>
+          <w:tcPr>
+            <w:tcW w:type="dxa" w:w="4320"/>
+          </w:tcPr>
+          <w:p>
+            <w:r>
+              <w:t>The model said it wrote a file but I can't see it</w:t>
+            </w:r>
+          </w:p>
+        </w:tc>
+        <w:tc>
+          <w:tcPr>
+            <w:tcW w:type="dxa" w:w="4320"/>
+          </w:tcPr>
+          <w:p>
+            <w:r>
+              <w:t>Open the Workspace panel on the right of the Language tab (it appears as soon as a file exists). The real files are in local-ai-studio\workspace\</w:t>
+            </w:r>
+          </w:p>
+        </w:tc>
+      </w:tr>
+      <w:tr>
+        <w:tc>
+          <w:tcPr>
+            <w:tcW w:type="dxa" w:w="4320"/>
+          </w:tcPr>
+          <w:p>
+            <w:r>
+              <w:t>I lost a conversation</w:t>
+            </w:r>
+          </w:p>
+        </w:tc>
+        <w:tc>
+          <w:tcPr>
+            <w:tcW w:type="dxa" w:w="4320"/>
+          </w:tcPr>
+          <w:p>
+            <w:r>
+              <w:t>Open 💬 Chats on the Language tab — every thread is there, newest first, named after the question that started it. They are files in local-ai-studio\chats\, so closing the browser loses nothing; only Delete removes one</w:t>
             </w:r>
           </w:p>
         </w:tc>
@@ -387,7 +495,7 @@
           </w:tcPr>
           <w:p>
             <w:r>
-              <w:t>Video says 'load the video model first'</w:t>
+              <w:t>Video takes ages to start</w:t>
             </w:r>
           </w:p>
         </w:tc>
@@ -397,7 +505,7 @@
           </w:tcPr>
           <w:p>
             <w:r>
-              <w:t>Press Load video model at the top of the tab — it frees every other model, which this one needs before it can start</w:t>
+              <w:t>It needs the whole card, so the queue frees every other model first — that eviction is the pause you are seeing, and the drawer says so</w:t>
             </w:r>
           </w:p>
         </w:tc>
@@ -497,7 +605,7 @@
           </w:tcPr>
           <w:p>
             <w:r>
-              <w:t>Video tab says a render is already running</w:t>
+              <w:t>I queued a second video by mistake</w:t>
             </w:r>
           </w:p>
         </w:tc>
@@ -507,7 +615,7 @@
           </w:tcPr>
           <w:p>
             <w:r>
-              <w:t>Only one video renders at a time — wait for it, or press Cancel and start again</w:t>
+              <w:t>It waits its turn rather than failing; × it in the queue drawer if you don't want it</w:t>
             </w:r>
           </w:p>
         </w:tc>
@@ -519,7 +627,7 @@
           </w:tcPr>
           <w:p>
             <w:r>
-              <w:t>Lullaby / Track Splitter says 'stop the loaded model first'</w:t>
+              <w:t>Lullaby / Track Splitter seems to hang before it starts</w:t>
             </w:r>
           </w:p>
         </w:tc>
@@ -529,7 +637,7 @@
           </w:tcPr>
           <w:p>
             <w:r>
-              <w:t>Both need the whole GPU for Demucs — Stop whatever tab's model is loaded, then try again</w:t>
+              <w:t>Both need the whole GPU for Demucs, so the queue frees the card first — the drawer says 'freeing the GPU' while it does</w:t>
             </w:r>
           </w:p>
         </w:tc>
@@ -607,7 +715,7 @@
           </w:tcPr>
           <w:p>
             <w:r>
-              <w:t>Composer says 'a song is already being composed/rendering'</w:t>
+              <w:t>Composer plan and render feel like two different waits</w:t>
             </w:r>
           </w:p>
         </w:tc>
@@ -617,7 +725,7 @@
           </w:tcPr>
           <w:p>
             <w:r>
-              <w:t>Only one Composer job runs at a time — wait for it or press Cancel, then start again</w:t>
+              <w:t>They are — planning needs the language model on the GPU, the render is CPU-only and runs on its own lane, so other GPU work can proceed while your song is being played and mixed</w:t>
             </w:r>
           </w:p>
         </w:tc>
@@ -639,7 +747,7 @@
           </w:tcPr>
           <w:p>
             <w:r>
-              <w:t>The genre template fills in anything the model leaves out or gets wrong — try a more specific brief, or a genre closer to what you want, and confirm a Language model is loaded and 'Plan with AI' is on</w:t>
+              <w:t>The genre template fills in anything the model leaves out or gets wrong — try a more specific brief, or a genre closer to what you want, and confirm 'Plan with AI' is on</w:t>
             </w:r>
           </w:p>
         </w:tc>

</xml_diff>